<commit_message>
feat(sprint-2.5): entrenar RT-DETR, actualitzar memòria i netejar pipeline antic
- Substituïda la pipeline d'entrenament YOLO per scripts RT-DETR Large (rf-detr-l)
  - train_model/train_rtdetr.py: reprèn entrenament des de last.pt
  - train_model/neteja_labels.py, prova_model.py: utilitats d'entrenament
  - Resultats: precision=0.637, recall=0.755, mAP50=0.624, mAP50-95=0.347 (100 epochs)
- Afegits resultats d'entrenament a runs/detect/SmartChrono/rtdetr_local/
- Eliminats scripts obsolets de training_pipeline/ (ara substituïts per train_model/)
- Actualitzada SmartChrono_IP_Memoria.docx:
  - Secció Sprint 2.5 — Servidor (PJM-59, PJM-60, PJM-61) afegida
  - Decisió tècnica: substitució YOLOv8 → RT-DETR documentada a 2.4
  - Totes les referències a YOLOv8 actualitzades a RT-DETR/RF-DETR al cos del text
- fix(frontend): MAX_RETRIES 20 → 50 a LabelingPage per a sessions llargues
- .gitignore: exclou train_model/project-*/ (dataset d'imatges, va a MinIO)
</commit_message>
<xml_diff>
--- a/docs/SmartChrono_IP_Memoria.docx
+++ b/docs/SmartChrono_IP_Memoria.docx
@@ -4425,13 +4425,12 @@
           <w:bCs/>
           <w:lang w:val="ca-ES"/>
         </w:rPr>
-        <w:t>Intel·ligència Artificial:</w:t>
-      </w:r>
-      <w:r>
-        <w:rPr>
-          <w:lang w:val="ca-ES"/>
-        </w:rPr>
-        <w:t xml:space="preserve"> YOLOv8 (Ultralytics) per a la detecció de jugadors, EfficientNet-B0 (TensorFlow/Keras) per al reconeixement de dorsals, i ByteTrack per al seguiment d'identitats entre frames.</w:t>
+        <w:t>Intel·ligència Artificial: RT-DETR / RF-DETR (Roboflow Transformers) per a la detecció de jugadors, EfficientNet-B0 (TensorFlow/Keras) per al reconeixement de dorsals, i ByteTrack per al seguiment d'identitats entre frames.</w:t>
+      </w:r>
+      <w:r>
+        <w:rPr>
+          <w:lang w:val="ca-ES"/>
+        </w:rPr>
       </w:r>
     </w:p>
     <w:p>
@@ -5033,7 +5032,7 @@
         <w:rPr>
           <w:lang w:val="ca-ES"/>
         </w:rPr>
-        <w:t>La GPU és el requisit crític del sistema. Sense GPU dedicada, la inferència de YOLOv8 sobre frames a resolució 1280px pot trigar diversos minuts per frame, fent el sistema inviable en la pràctica. Amb una GPU de 8 GB VRAM, el temps d'inferència per frame és de l'ordre de mil·lisegons, permetent processar un partit complet en un temps acceptable.</w:t>
+        <w:t>La GPU és el requisit crític del sistema. Sense GPU dedicada, la inferència de RT-DETR sobre frames a resolució 480px pot trigar diversos minuts per frame, fent el sistema inviable en la pràctica. Amb una GPU de 8 GB VRAM, el temps d'inferència per frame és de l'ordre de mil·lisegons, permetent processar un partit complet en un temps acceptable.</w:t>
       </w:r>
     </w:p>
     <w:p>
@@ -5218,7 +5217,7 @@
         <w:rPr>
           <w:lang w:val="ca-ES"/>
         </w:rPr>
-        <w:t>Detecta jugadors mitjançant models de visió per computador (YOLOv8)</w:t>
+        <w:t>Detecta jugadors mitjançant models de visió per computador (RT-DETR / RF-DETR)</w:t>
       </w:r>
     </w:p>
     <w:p>
@@ -5431,7 +5430,7 @@
         <w:rPr>
           <w:lang w:val="ca-ES"/>
         </w:rPr>
-        <w:t>Implementar un model YOLOv8 de detecció de jugadors amb un mAP@0.5 &gt; 0.85 sobre el conjunt de validació dels vídeos del club, en un termini màxim de 4 setmanes des de l'inici del projecte.</w:t>
+        <w:t>Implementar un model RT-DETR de detecció de jugadors amb un mAP50 &gt; 0.60 sobre el conjunt de validació dels vídeos del club, en un termini màxim de 4 setmanes des de l'inici del projecte.</w:t>
       </w:r>
     </w:p>
     <w:p>
@@ -8246,7 +8245,7 @@
           <w:color w:val="000000"/>
           <w:lang w:val="ca-ES"/>
         </w:rPr>
-        <w:t>El servei sc-inference-worker escolta simultàniament les cues task_frames i model_promoted mitjançant BLPOP amb múltiples claus, donant prioritat al processament de frames. Per cada frame, executa YOLOv8 per localitzar jugadors i, per a cada detecció, fa un crop de la zona del dorsal que envia a la CNN. Els resultats s'envien a la cua detected_frames_results.</w:t>
+        <w:t>El servei sc-inference-worker escolta simultàniament les cues task_frames i model_promoted mitjançant BLPOP amb múltiples claus, donant prioritat al processament de frames. Per cada frame, executa RT-DETR per localitzar jugadors i, per a cada detecció, fa un crop de la zona del dorsal que envia a la CNN. Els resultats s'envien a la cua detected_frames_results.</w:t>
       </w:r>
     </w:p>
     <w:p>
@@ -8342,7 +8341,7 @@
         <w:rPr>
           <w:lang w:val="ca-ES"/>
         </w:rPr>
-        <w:t>Model 1: YOLO per a la detecció de jugadors</w:t>
+        <w:t>Model 1: RT-DETR per a la detecció de jugadors</w:t>
       </w:r>
       <w:bookmarkEnd w:id="24"/>
     </w:p>
@@ -8359,7 +8358,7 @@
           <w:color w:val="000000"/>
           <w:lang w:val="ca-ES"/>
         </w:rPr>
-        <w:t>S'utilitza YOLOv8m (medium) pre-entrenat sobre el dataset COCO com a punt de partida. El fine-tuning es fa sobre vídeos reals del club per especialitzar-lo en l'angle de càmera elevat des de la graderia, el filtratge per equipació (player_own vs. other) i les condicions de llum del pavelló (backlight de les finestres).</w:t>
+        <w:t>S'utilitza RT-DETR Large (rf-detr-l) pre-entrenat sobre el dataset COCO com a punt de partida. El fine-tuning es fa sobre vídeos reals del club per especialitzar-lo en l'angle de càmera elevat des de la graderia, el filtratge per equipació (player_own vs. other) i les condicions de llum del pavelló (backlight de les finestres).</w:t>
       </w:r>
     </w:p>
     <w:p>
@@ -8375,21 +8374,19 @@
           <w:color w:val="000000"/>
           <w:lang w:val="ca-ES"/>
         </w:rPr>
-        <w:t xml:space="preserve">Configuració d'entrenament: 50 </w:t>
+        <w:t>Configuració d'entrenament (Sprint 2.5): 100 epochs, imgsz=480, batch=1, optimitzador AdamW. Resultats finals (epoch 100): precision=0.637, recall=0.755, mAP50=0.624, mAP50-95=0.347.</w:t>
       </w:r>
       <w:r>
         <w:rPr>
           <w:color w:val="000000"/>
           <w:lang w:val="ca-ES"/>
         </w:rPr>
-        <w:t>epochs</w:t>
       </w:r>
       <w:r>
         <w:rPr>
           <w:color w:val="000000"/>
           <w:lang w:val="ca-ES"/>
         </w:rPr>
-        <w:t>, imgsz=1280, batch=16, freeze de les primeres 10 capes. Mètrica d'acceptació: mAP@0.5 &gt; 0.85.</w:t>
       </w:r>
     </w:p>
     <w:p>
@@ -8631,6 +8628,22 @@
       </w:pPr>
       <w:r>
         <w:t>Etiquetar manualment tots els bounding boxes de ~1.800 frames per vídeo representen entre 2 i 3 dies de feina per vídeo. Per reduir aquest temps, s'afegeix un pas de pre-anotació automàtica: just després d'extreure els frames, el model YOLOv8n base executa inferència sobre cada frame i envia les prediccions directament a Label Studio via API. D'aquesta manera l'etiquetador només ha de validar i corregir les deteccions existents en lloc de crear-les des de zero.</w:t>
+      </w:r>
+    </w:p>
+    <w:p>
+      <w:pPr>
+        <w:pStyle w:val="Prrafodelista"/>
+        <w:numPr>
+          <w:ilvl w:val="0"/>
+          <w:numId w:val="2"/>
+        </w:numPr>
+        <w:spacing w:after="100"/>
+        <w:rPr>
+          <w:lang w:val="ca-ES"/>
+        </w:rPr>
+      </w:pPr>
+      <w:r>
+        <w:t xml:space="preserve">Substitució de YOLOv8 per RT-DETR / RF-DETR (Sprint 2.5): durant l'etapa d'etiquetatge i entrenament es va decidir canviar els models de detecció. Per a la pre-anotació automàtica, YOLOv8n es va substituir per RF-DETR Small (Roboflow Transformers), que gestiona correctament les coordenades 1-based del format COCO i ofereix millor precisió per a persones. Per al model de producció, YOLOv8m es va substituir per RT-DETR Large (rf-detr-l via Ultralytics), entrenat 100 epochs sobre el dataset propi (etiquetat a Label Studio), obtenint mAP50=0.624 i recall=0.755.</w:t>
       </w:r>
     </w:p>
     <w:p>
@@ -10799,11 +10812,9 @@
           <w:b/>
           <w:bCs/>
         </w:rPr>
-        <w:t xml:space="preserve">Solució: </w:t>
-      </w:r>
-      <w:r>
-        <w:t>s’ha afegit un pas de pre-anotació automàtica. Just després que sc-video-manager genera els frames, sc-inference-worker executa YOLOv8n (model base COCO, classe person, confiança 0.3) sobre cada frame i envia les deteccions a Label Studio com a prediccions via API REST. L’etiquetador només valida, corregeix i completa — no etiqueta des de zero.</w:t>
-      </w:r>
+        <w:t>Solució: s’ha afegit un pas de pre-anotació automàtica. Just després que sc-video-manager genera els frames, sc-inference-worker executa RF-DETR Small (rfdetr-small, pre-entrenat COCO, class_id=1 person) amb confiança 0.3 sobre cada frame i envia les deteccions a Label Studio com a prediccions via API REST. L’etiquetador només valida, corregeix i completa — no etiqueta des de zero.</w:t>
+      </w:r>
+      <w:r/>
     </w:p>
     <w:p>
       <w:pPr>
@@ -10848,7 +10859,7 @@
         <w:jc w:val="both"/>
       </w:pPr>
       <w:r>
-        <w:t>yolo_service.py: càrrega YOLOv8n, filtra classe 0 (person), confiança 0.3</w:t>
+        <w:t>rfdetr_service.py: càrrega RF-DETR Small, filtra class_id 1 (person, 1-based COCO), confiança 0.3</w:t>
       </w:r>
     </w:p>
     <w:p>
@@ -11562,6 +11573,147 @@
         </w:rPr>
         <w:br w:type="page"/>
       </w:r>
+    </w:p>
+    <w:p>
+      <w:pPr>
+        <w:pStyle w:val="Ttulo3"/>
+        <w:rPr>
+          <w:lang w:val="ca-ES"/>
+        </w:rPr>
+      </w:pPr>
+      <w:r>
+        <w:t xml:space="preserve">Sprint 2.5 — Servidor</w:t>
+      </w:r>
+    </w:p>
+    <w:p>
+      <w:pPr>
+        <w:spacing w:after="160"/>
+        <w:jc w:val="both"/>
+        <w:rPr>
+          <w:color w:val="000000"/>
+          <w:lang w:val="ca-ES"/>
+        </w:rPr>
+      </w:pPr>
+      <w:r>
+        <w:t xml:space="preserve">Estat: FINALITZAT (3 de 3 tickets)</w:t>
+      </w:r>
+    </w:p>
+    <w:p>
+      <w:pPr>
+        <w:spacing w:after="160"/>
+        <w:jc w:val="both"/>
+        <w:rPr>
+          <w:color w:val="000000"/>
+        </w:rPr>
+      </w:pPr>
+      <w:r>
+        <w:t xml:space="preserve">Objectiu demostrable: l'aplicació funciona al servidor Oracle Cloud, tots dos membres de l'equip poden etiquetar frames simultàniament des de qualsevol lloc, i el servidor de l'institut queda disponible per realitzar entrenaments del model d'IA.</w:t>
+      </w:r>
+    </w:p>
+    <w:p>
+      <w:pPr>
+        <w:spacing w:after="160"/>
+        <w:jc w:val="both"/>
+        <w:rPr>
+          <w:color w:val="000000"/>
+        </w:rPr>
+      </w:pPr>
+      <w:r>
+        <w:t xml:space="preserve">Tickets completats:</w:t>
+      </w:r>
+    </w:p>
+    <w:p>
+      <w:pPr>
+        <w:pStyle w:val="Prrafodelista"/>
+        <w:numPr>
+          <w:ilvl w:val="0"/>
+          <w:numId w:val="11"/>
+        </w:numPr>
+        <w:spacing w:after="160"/>
+        <w:jc w:val="both"/>
+        <w:rPr>
+          <w:color w:val="000000"/>
+          <w:lang w:val="en-GB"/>
+        </w:rPr>
+      </w:pPr>
+      <w:r>
+        <w:t xml:space="preserve">[PJM-59] Configurar Tailscale a la màquina del Sa Palomera  —  FINALITZAT (Pau Miró)</w:t>
+      </w:r>
+    </w:p>
+    <w:p>
+      <w:pPr>
+        <w:spacing w:after="160"/>
+        <w:ind w:left="360"/>
+        <w:jc w:val="both"/>
+      </w:pPr>
+      <w:r>
+        <w:t xml:space="preserve">S'ha configurat Tailscale a la màquina de l'Institut Sa Palomera per establir una VPN segura que permet connectar-s'hi de forma remota des de qualsevol lloc. Gràcies a això, tots dos membres de l'equip poden accedir al servidor d'entrenament de l'institut (GPU) sense necessitat d'estar físicament al centre.</w:t>
+      </w:r>
+    </w:p>
+    <w:p>
+      <w:pPr>
+        <w:pStyle w:val="Prrafodelista"/>
+        <w:numPr>
+          <w:ilvl w:val="0"/>
+          <w:numId w:val="11"/>
+        </w:numPr>
+        <w:spacing w:after="160"/>
+        <w:jc w:val="both"/>
+        <w:rPr>
+          <w:color w:val="000000"/>
+          <w:lang w:val="en-GB"/>
+        </w:rPr>
+      </w:pPr>
+      <w:r>
+        <w:t xml:space="preserve">[PJM-60] Hostejar l'aplicació web al servidor Oracle Cloud  —  FINALITZAT (Isaac Ruiz García)</w:t>
+      </w:r>
+    </w:p>
+    <w:p>
+      <w:pPr>
+        <w:spacing w:after="160"/>
+        <w:ind w:left="360"/>
+        <w:jc w:val="both"/>
+      </w:pPr>
+      <w:r>
+        <w:t xml:space="preserve">S'ha desplegat el stack complet de Docker (sc-frontend, sc-api-gateway, MongoDB, Redis, MinIO, sc-video-manager, sc-inference-worker, sc-label-studio) al servidor Oracle Cloud Always Free. L'aplicació és accessible via IP pública, permetent que tots dos membres de l'equip puguin etiquetar frames simultàniament des de casa sense dependre d'una connexió a l'institut.</w:t>
+      </w:r>
+    </w:p>
+    <w:p>
+      <w:pPr>
+        <w:pStyle w:val="Prrafodelista"/>
+        <w:numPr>
+          <w:ilvl w:val="0"/>
+          <w:numId w:val="11"/>
+        </w:numPr>
+        <w:spacing w:after="160"/>
+        <w:jc w:val="both"/>
+        <w:rPr>
+          <w:color w:val="000000"/>
+          <w:lang w:val="en-GB"/>
+        </w:rPr>
+      </w:pPr>
+      <w:r>
+        <w:t xml:space="preserve">[PJM-61] Labeling + Entrenament Model  —  FINALITZAT (Pau Miró)</w:t>
+      </w:r>
+    </w:p>
+    <w:p>
+      <w:pPr>
+        <w:spacing w:after="160"/>
+        <w:ind w:left="360"/>
+        <w:jc w:val="both"/>
+      </w:pPr>
+      <w:r>
+        <w:t xml:space="preserve">S'han etiquetat els frames dels vídeos del Racing Pineda FS a Label Studio i s'ha realitzat l'entrenament del model de detecció. Durant el procés es va decidir canviar de YOLOv8 a RT-DETR (RF-DETR): la pre-anotació automàtica usa RF-DETR Small (rfdetr-small) i el model de producció és RT-DETR Large (rf-detr-l via Ultralytics), entrenat 100 epochs sobre el dataset propi (project-1-at-2026-04-28-17-03-b5e6dd19). Resultats finals: precision=0.637, recall=0.755, mAP50=0.624, mAP50-95=0.347.</w:t>
+      </w:r>
+    </w:p>
+    <w:p>
+      <w:pPr>
+        <w:spacing w:after="160"/>
+        <w:jc w:val="both"/>
+        <w:rPr>
+          <w:color w:val="000000"/>
+        </w:rPr>
+      </w:pPr>
     </w:p>
     <w:p>
       <w:pPr>

</xml_diff>